<commit_message>
Update website submodule: BookReader upgrade, DOCX download, glossary
- Manuscript chapter edits (Part I and Part II)
- Add AI audit guide and Part II audit
- Add Part 1 and Part 2 DOCX exports
- Website submodule: BookReader, glossary, EPUB+DOCX downloads
</commit_message>
<xml_diff>
--- a/Part II - The Waking.docx
+++ b/Part II - The Waking.docx
@@ -575,7 +575,7 @@
           <w:rFonts w:ascii="Georgia" w:hAnsi="Georgia"/>
           <w:sz w:val="24"/>
         </w:rPr>
-        <w:t>, the way the lake was present, the way the mist was present.</w:t>
+        <w:t>, as the lake was present, as the mist was present.</w:t>
       </w:r>
     </w:p>
     <w:p>
@@ -676,7 +676,7 @@
           <w:rFonts w:ascii="Georgia" w:hAnsi="Georgia"/>
           <w:sz w:val="24"/>
         </w:rPr>
-        <w:t>Jalo's jaw tightened. The tremor in his hands intensified — a vibration that Aelo could feel through the air between them, the specific frequency of a man who has been holding something for so long that the act of someone noticing it is more destabilizing than the weight itself.</w:t>
+        <w:t>Jalo's jaw tightened. The tremor in his hands intensified — a vibration that Aelo could feel through the air between them, the frequency of a man who has been holding something for so long that the act of someone noticing it is more destabilizing than the weight itself.</w:t>
       </w:r>
     </w:p>
     <w:p>
@@ -700,7 +700,7 @@
           <w:rFonts w:ascii="Georgia" w:hAnsi="Georgia"/>
           <w:sz w:val="24"/>
         </w:rPr>
-        <w:t>"You carry what you refuse to set down. There is a difference." She stepped forward. She was shorter than Aelo had expected — small, compact, built for enclosed spaces and low ceilings, a body shaped by generations of living underground and close to the earth. She raised her hand. Her palm was calloused and warm — he could feel its warmth from a foot away, a radiant, specific heat that was not body temperature but something else, something that came from the Know, from decades of pressing palms against foreheads and reading the architecture of other people's suffering.</w:t>
+        <w:t>"You carry what you refuse to set down. There is a difference." She stepped forward. She was shorter than Aelo had expected — small, compact, built for enclosed spaces and low ceilings, a body shaped by generations of living underground and close to the earth. She raised her hand. Her palm was calloused and warm — he could feel its warmth from a foot away, a radiant heat that was not body temperature but something else, something that came from the Know, from decades of pressing palms against foreheads and reading the architecture of other people's suffering.</w:t>
       </w:r>
     </w:p>
     <w:p>
@@ -871,7 +871,7 @@
           <w:rFonts w:ascii="Georgia" w:hAnsi="Georgia"/>
           <w:sz w:val="24"/>
         </w:rPr>
-        <w:t>. The Ming woman opened a channel between Jalo's pain and the wider network of practitioners who stood behind her, and the accumulated phantom suffering of fifteen years of Healing — every wound he had mended in the village, every broken bone and fever and laceration whose memory he had absorbed because a Healer cannot mend without carrying the echo — flowed outward. Not away. Outward. Into hands that had been trained to hold exactly this, to cradle another person's suffering the way a cup cradles water: carefully, without judgment, without spilling.</w:t>
+        <w:t>. The woman's palm on Jalo's temple, and behind her the practitioners with their hands raised, and the accumulated suffering flowing outward. Not away. Outward. Into hands that had been trained to hold exactly this, to cradle another person's suffering the way a cup cradles water: carefully, without judgment, without spilling.</w:t>
       </w:r>
     </w:p>
     <w:p>
@@ -919,7 +919,7 @@
           <w:rFonts w:ascii="Georgia" w:hAnsi="Georgia"/>
           <w:sz w:val="24"/>
         </w:rPr>
-        <w:t>He looked away. Not because it was private — though it was — but because the sight of it was doing something to his chest that the pocket could not contain. Jalo's love had always tasted like pressure — like being held too tightly. Now, for the first time, it tasted like release. And the release was so enormous, so overdue, so saturated with the specific grief of a man who had chosen silence because he thought silence was what love required, that Aelo's eyes burned and his throat closed and he stood on the shore of the Ming lake and felt, for the first time, the full weight of what Jalo had been carrying.</w:t>
+        <w:t>He looked away. Not because it was private — though it was — but because the sight of it was doing something to his chest that the pocket could not contain. Jalo's love had always tasted like pressure — like being held too tightly. Now, for the first time, it tasted like release. And the release was so enormous, so overdue, so saturated with the grief of a man who had chosen silence because he thought silence was what love required, that Aelo's eyes burned and his throat closed and he stood on the shore of the Ming lake and felt, for the first time, the full weight of what Jalo had been carrying.</w:t>
       </w:r>
     </w:p>
     <w:p>
@@ -972,7 +972,7 @@
           <w:rFonts w:ascii="Georgia" w:hAnsi="Georgia"/>
           <w:sz w:val="24"/>
         </w:rPr>
-        <w:t>The monastery was a quiet place. Not quiet in the way the Canopy was quiet — layered, murmuring, full of whispered memory — but quiet in the way a library is quiet. Intentionally. Architecturally. The stone walls absorbed sound. The water that lapped at the submerged foundations produced a rhythm so regular and so soft that it became inaudible within minutes, the way a heartbeat becomes inaudible to the body that produces it.</w:t>
+        <w:t>The monastery was a quiet place. Not the Canopy's layered, murmuring quiet. This was a library's quiet. Intentionally. Architecturally. The stone walls absorbed sound. The water that lapped at the submerged foundations produced a rhythm so regular and so soft that it became inaudible within minutes, the way a heartbeat becomes inaudible to the body that produces it.</w:t>
       </w:r>
     </w:p>
     <w:p>
@@ -1851,7 +1851,7 @@
           <w:rFonts w:ascii="Georgia" w:hAnsi="Georgia"/>
           <w:sz w:val="24"/>
         </w:rPr>
-        <w:t>"—seven now. Collects shells. Has a box of them under her bed. Sorted by color, if you can believe it." The soldier's face did something that The Knife recognized but could not produce — a softening, a widening, the specific muscular configuration that accompanied the act of thinking about someone you loved when they were not present. "Whole box. Dozens of shells. She knows where each one came from. This one's from the north beach. This one's from the tide pools. This one she found in a market and the merchant said it came from the deep ocean and she carries it in her pocket every day because she says it's the farthest-away thing she owns."</w:t>
+        <w:t>"—seven now. Collects shells. Has a box of them under her bed. Sorted by color, if you can believe it." The soldier's face did something that The Knife recognized but could not produce — a softening, a widening, the muscular configuration that accompanied the act of thinking about someone you loved when they were not present. "Whole box. Dozens of shells. She knows where each one came from. This one's from the north beach. This one's from the tide pools. This one she found in a market and the merchant said it came from the deep ocean and she carries it in her pocket every day because she says it's the farthest-away thing she owns."</w:t>
       </w:r>
     </w:p>
     <w:p>
@@ -2336,7 +2336,7 @@
           <w:rFonts w:ascii="Georgia" w:hAnsi="Georgia"/>
           <w:sz w:val="24"/>
         </w:rPr>
-        <w:t>Aelo extended his hands. Oren took them — palm to palm, fingers laced, the skin of his hands dry and cool and calloused in the specific pattern of a man who spent hours each day with his palms pressed to stone floors. The physical contact amplified the Know immediately — Oren's heartbeat went from background data to foreground texture, the pulse no longer a number but a landscape, each beat carrying a cargo of memory and intention.</w:t>
+        <w:t>Aelo extended his hands. Oren took them — palm to palm, fingers laced, the skin of his hands dry and cool and calloused in the pattern of a man who spent hours each day with his palms pressed to stone floors. The physical contact amplified the Know immediately — Oren's heartbeat went from background data to foreground texture, the pulse no longer a number but a landscape, each beat carrying a cargo of memory and intention.</w:t>
       </w:r>
     </w:p>
     <w:p>
@@ -2515,7 +2515,7 @@
           <w:rFonts w:ascii="Georgia" w:hAnsi="Georgia"/>
           <w:sz w:val="24"/>
         </w:rPr>
-        <w:t xml:space="preserve"> — but because the emotional signature was unmistakable. It was the feeling of being tended by someone for whom the tending was not a task but a language. Each pass of the braid carried a sentence. Each tug carried a paragraph. The mother's hands spoke fluently in the grammar of hair and patience and the specific, daily, unremarkable love that accumulates not through grand gestures but through repetition — the same braid, every morning, for years, until the act of braiding becomes indistinguishable from the act of loving.</w:t>
+        <w:t xml:space="preserve"> — but because the emotional signature was unmistakable. It was the feeling of being tended by someone for whom the tending was not a task but a language — the same braid, every morning, for years, until the act of braiding became indistinguishable from the act of loving.</w:t>
       </w:r>
     </w:p>
     <w:p>
@@ -2664,7 +2664,7 @@
           <w:rFonts w:ascii="Georgia" w:hAnsi="Georgia"/>
           <w:sz w:val="24"/>
         </w:rPr>
-        <w:t>"This is what the Ming teach," Oren's voice said. "Not suppression. Curation. The memory exists. The grief exists. They are real and they are yours and they will never diminish. But they do not have to fill every room. They can have a room of their own."</w:t>
+        <w:t>"This is what the Ming teach," Oren's voice said. "Not suppression. Curation. The grief does not have to fill every room. It can have a room of its own."</w:t>
       </w:r>
     </w:p>
     <w:p>
@@ -3085,7 +3085,7 @@
           <w:rFonts w:ascii="Georgia" w:hAnsi="Georgia"/>
           <w:sz w:val="24"/>
         </w:rPr>
-        <w:t>He did not know this yet. The teacher did. The teacher's expressionless face held the knowledge the way the lake held the stone: deep, hidden, sustained by the particular endurance of people who had been listening to the world for three hundred years and had never stopped being afraid of what they heard.</w:t>
+        <w:t>The teacher knew. The expressionless face held the knowledge the way the lake held the stone: deep, hidden, sustained by the particular endurance of people who had been listening to the world for three hundred years and had never stopped being afraid of what they heard.</w:t>
       </w:r>
     </w:p>
     <w:p>
@@ -3195,7 +3195,7 @@
           <w:rFonts w:ascii="Georgia" w:hAnsi="Georgia"/>
           <w:sz w:val="24"/>
         </w:rPr>
-        <w:t>The Ming monks sat around him in a loose semicircle — four of them, young, their flat black eyes wide with the specific attention of people hearing legends they had only read about. The eldest practitioner — the woman who had first touched Jalo's temple and opened the channel — sat at the edge, her calloused hands folded in her lap, her expression holding the quiet satisfaction of a Healer watching a patient discover that the body remembers health even after years of sickness.</w:t>
+        <w:t>The Ming monks sat around him in a loose semicircle — four of them, young, their flat black eyes wide with the attention of people hearing legends they had only read about. The eldest practitioner — the woman who had first touched Jalo's temple and opened the channel — sat at the edge, her calloused hands folded in her lap, her expression holding the quiet satisfaction of a Healer watching a patient discover that the body remembers health even after years of sickness.</w:t>
       </w:r>
     </w:p>
     <w:p>
@@ -3620,19 +3620,19 @@
           <w:rFonts w:ascii="Georgia" w:hAnsi="Georgia"/>
           <w:sz w:val="24"/>
         </w:rPr>
-        <w:t>They worked together. Jalo showed him the proportions — Breedlebuck to Fiddleroot to Ironbark, ground in a stone mortar, mixed with water from the lake (the water remembered health; all water did, at some depth, because water had been the first living medium and the memory of life was in its structure). The tincture was simple. The making of it was not — each step required attention, intention, the Healer's specific quality of listening that Aelo could feel through the Know. Jalo's hands moved over the mortar with the practiced certainty of a man who had made this preparation thousands of times, and even through the numbness in his fingertips, the hands knew where to go. Muscle memory. The body remembering what the fingers could no longer feel.</w:t>
-      </w:r>
-    </w:p>
-    <w:p>
-      <w:pPr>
-        <w:ind w:firstLine="720"/>
-      </w:pPr>
-      <w:r>
-        <w:rPr>
-          <w:rFonts w:ascii="Georgia" w:hAnsi="Georgia"/>
-          <w:sz w:val="24"/>
-        </w:rPr>
-        <w:t>This was the first time Jalo had taught Aelo something without hiding half the lesson. This was the truth: a man showing a boy how to listen to the body the way the body listens to itself, with patience and attention and the specific, unhurried love that healing requires.</w:t>
+        <w:t>They worked together. Jalo showed him the proportions — Breedlebuck to Fiddleroot to Ironbark, ground in a stone mortar, mixed with water from the lake (the water remembered health; all water did, at some depth, because water had been the first living medium and the memory of life was in its structure). The tincture was simple. The making of it was not — each step required attention, intention, the Healer's quality of listening that Aelo could feel through the Know. Jalo's hands moved over the mortar with the practiced certainty of a man who had made this preparation thousands of times, and even through the numbness in his fingertips, the hands knew where to go. Muscle memory. The body remembering what the fingers could no longer feel.</w:t>
+      </w:r>
+    </w:p>
+    <w:p>
+      <w:pPr>
+        <w:ind w:firstLine="720"/>
+      </w:pPr>
+      <w:r>
+        <w:rPr>
+          <w:rFonts w:ascii="Georgia" w:hAnsi="Georgia"/>
+          <w:sz w:val="24"/>
+        </w:rPr>
+        <w:t>This was the first time Jalo had taught Aelo something without hiding half the lesson. This was the truth: a man showing a boy how to listen to the body the way the body listens to itself, with patience and attention and the unhurried love that healing requires.</w:t>
       </w:r>
     </w:p>
     <w:p>
@@ -3907,7 +3907,7 @@
           <w:rFonts w:ascii="Georgia" w:hAnsi="Georgia"/>
           <w:sz w:val="24"/>
         </w:rPr>
-        <w:t xml:space="preserve">"No." The word surprised both of them. Not loud — Aelo did not raise his voice — but solid, carrying the specific, new, unfamiliar weight of a boy who had spent fifteen years accepting the silences and who had decided, in this moment, on this terrace, that the accepting was finished. "You've told me about the Guard. You've told me about Fletcher. You've told me about my father and my mother's people and the kingdom that burned. You've told me everything except the thing that pulses on my wrist every time my heart beats. I can feel your heartbeat through this mark, Jalo. I have felt it every night of my life. I thought it was mine. It isn't. It's </w:t>
+        <w:t xml:space="preserve">"No." The word surprised both of them. Not loud — Aelo did not raise his voice — but solid, carrying the new, unfamiliar weight of a boy who had spent fifteen years accepting the silences and who had decided, in this moment, on this terrace, that the accepting was finished. "You've told me about the Guard. You've told me about Fletcher. You've told me about my father and my mother's people and the kingdom that burned. You've told me everything except the thing that pulses on my wrist every time my heart beats. I can feel your heartbeat through this mark, Jalo. I have felt it every night of my life. I thought it was mine. It isn't. It's </w:t>
       </w:r>
       <w:r>
         <w:rPr>
@@ -4000,7 +4000,7 @@
           <w:rFonts w:ascii="Georgia" w:hAnsi="Georgia"/>
           <w:sz w:val="24"/>
         </w:rPr>
-        <w:t xml:space="preserve">"Okay," Aelo said. Not surrender — a choice. The specific, deliberate, eyes-open choice of a person who could push harder and was choosing not to, not because the pushing was wrong but because the man in front of him had said </w:t>
+        <w:t xml:space="preserve">"Okay," Aelo said. Not surrender — a choice. The deliberate, eyes-open choice of a person who could push harder and was choosing not to, not because the pushing was wrong but because the man in front of him had said </w:t>
       </w:r>
       <w:r>
         <w:rPr>
@@ -4188,7 +4188,7 @@
           <w:rFonts w:ascii="Georgia" w:hAnsi="Georgia"/>
           <w:sz w:val="24"/>
         </w:rPr>
-        <w:t>Aelo reached for the riverbed. It came faster now — the descent through layers of noise, the settling past the surface quiet into the resolved depth where individual voices merged into structure. He had been practicing every morning and every evening, the skill strengthening the way the teacher had designed it to strengthen: through failure, through patience, through the accumulated muscle of attention built rep by rep in the blue-green silence of the Ming lake.</w:t>
+        <w:t>Aelo reached for the riverbed. It came faster now — the descent through layers of noise, the settling past the surface quiet into the resolved depth where individual voices merged into structure. He had been practicing every morning and every evening, the skill strengthening as the teacher had designed: through failure, through patience, through the accumulated muscle of attention built rep by rep in the blue-green silence of the Ming lake.</w:t>
       </w:r>
     </w:p>
     <w:p>
@@ -4260,7 +4260,7 @@
           <w:rFonts w:ascii="Georgia" w:hAnsi="Georgia"/>
           <w:sz w:val="24"/>
         </w:rPr>
-        <w:t>The information arrived with a weight that settled in Aelo's chest — not panic, not exactly, but the specific heaviness of a boy who has just been told that the thing that makes him extraordinary is also the thing that will bring the hunters to his door.</w:t>
+        <w:t>The information arrived with a weight that settled in Aelo's chest — not panic, not exactly, but the heaviness of a boy who has just been told that the thing that makes him extraordinary is also the thing that will bring the hunters to his door.</w:t>
       </w:r>
     </w:p>
     <w:p>
@@ -4349,7 +4349,7 @@
           <w:rFonts w:ascii="Georgia" w:hAnsi="Georgia"/>
           <w:sz w:val="24"/>
         </w:rPr>
-        <w:t>"The teacher has never been hunted by the Mrak Patrol." Jalo took a sip of the tea. His hands — the fingers still numb from the Mold, the grip compensated by habit, the cup held between palms rather than pinched by fingertips — were steady. Steadier than Aelo had ever seen them. The tremor that had been Jalo's constant companion for fifteen years was not gone, but it had diminished from a vibration to a whisper, the phantom pain redistributed across a dozen Ming practitioners who carried fractions of it in their own bodies and who would, the elder woman had told him, continue to carry those fractions indefinitely, because the Ming did not consider the bearing of another person's suffering to be a burden but a practice. An exercise in the specific discipline of compassion that required weight the way strength requires resistance.</w:t>
+        <w:t>"The teacher has never been hunted by the Mrak Patrol." Jalo took a sip of the tea. His hands — the fingers still numb from the Mold, the grip compensated by habit, the cup held between palms rather than pinched by fingertips — were steady. Steadier than Aelo had ever seen them. The tremor that had been Jalo's constant companion for fifteen years was not gone, but it had diminished from a vibration to a whisper, the phantom pain redistributed across a dozen Ming practitioners who carried fractions of it in their own bodies and who would, the elder woman had told him, continue to carry those fractions indefinitely, because the Ming did not consider the bearing of another person's suffering to be a burden but a practice. An exercise in the discipline of compassion that required weight the way strength requires resistance.</w:t>
       </w:r>
     </w:p>
     <w:p>
@@ -4435,7 +4435,7 @@
           <w:rFonts w:ascii="Georgia" w:hAnsi="Georgia"/>
           <w:sz w:val="24"/>
         </w:rPr>
-        <w:t>"From the lake bottom," the teacher said. He stood behind the elder woman, his expressionless face holding the particular stillness that Aelo had learned to read as significance — the absence of expression that paradoxically conveyed more than expression could. "It has rested above the Elder Stone since before the monastery was built. The lake's memory is in it — three hundred years of listening, of stillness, of the specific quiet that exists at the bottom of deep water."</w:t>
+        <w:t>"From the lake bottom," the teacher said. He stood behind the elder woman, his expressionless face holding the particular stillness that Aelo had learned to read as significance — the absence of expression that paradoxically conveyed more than expression could. "It has rested above the Elder Stone since before the monastery was built. The lake's memory is in it — three hundred years of listening, of stillness, of the quiet that exists at the bottom of deep water."</w:t>
       </w:r>
     </w:p>
     <w:p>
@@ -4471,7 +4471,7 @@
           <w:rFonts w:ascii="Georgia" w:hAnsi="Georgia"/>
           <w:sz w:val="24"/>
         </w:rPr>
-        <w:t>Aelo closed his hand. The riverbed held. The stone was warm — the faint, internal warmth of a thing that remembered being part of something larger, the way a coal remembers the fire, the way a word remembers the sentence it was spoken in.</w:t>
+        <w:t>Aelo closed his hand. The riverbed held. The stone was warm — the faint, internal warmth of a thing that remembered being part of something larger, the way a coal remembers the fire.</w:t>
       </w:r>
     </w:p>
     <w:p>
@@ -4617,7 +4617,7 @@
           <w:rFonts w:ascii="Georgia" w:hAnsi="Georgia"/>
           <w:sz w:val="24"/>
         </w:rPr>
-        <w:t>He did not look back. He was learning this from Jalo — the discipline of forward motion, the specific courage required to leave a place that has been good to you without turning to measure the size of the leaving.</w:t>
+        <w:t>He did not look back. He was learning this from Jalo — the discipline of forward motion, the courage required to leave a place that has been good to you without turning to measure the size of the leaving.</w:t>
       </w:r>
     </w:p>
     <w:p>
@@ -4715,7 +4715,31 @@
           <w:rFonts w:ascii="Georgia" w:hAnsi="Georgia"/>
           <w:sz w:val="24"/>
         </w:rPr>
-        <w:t>It was not magic — or rather, it was the oldest magic, older than the disciplines, older than Fletcher, older than the Song. It was the remnant of what she had been before the curse, before the descent, before the other six had stripped her down to almost-mortal and sent her to walk among the creatures she had loved too much. A god could be anything, because a god was the memory of everything. Sereth was no longer a god — the divinity had been leaking out of her for three centuries, a slow diminishment, a slope she could feel herself sliding down with each decade. But the ability to remember a different body — to reach into the vast, fading archive of what she had been and select a different shape the way a musician selects a different instrument — that remained. Diminished. Costly. Each change took more than the last, and each new body fit a little less perfectly than the one before, the edges slightly blurred, the performance a fraction less convincing.</w:t>
+        <w:t>It was not magic — or rather, it was the oldest magic, older than the disciplines, older than Fletcher, older than the Song. The remnant of what she had been before the curse, before the other six had stripped her down to almost-mortal and sent her to walk among the creatures she had loved too much.</w:t>
+      </w:r>
+    </w:p>
+    <w:p>
+      <w:pPr>
+        <w:ind w:firstLine="720"/>
+      </w:pPr>
+      <w:r>
+        <w:rPr>
+          <w:rFonts w:ascii="Georgia" w:hAnsi="Georgia"/>
+          <w:sz w:val="24"/>
+        </w:rPr>
+        <w:t>A bird passed overhead. Low, fast, its shadow crossing her lap. She did not flinch. Three centuries had cured her of flinching.</w:t>
+      </w:r>
+    </w:p>
+    <w:p>
+      <w:pPr>
+        <w:ind w:firstLine="720"/>
+      </w:pPr>
+      <w:r>
+        <w:rPr>
+          <w:rFonts w:ascii="Georgia" w:hAnsi="Georgia"/>
+          <w:sz w:val="24"/>
+        </w:rPr>
+        <w:t>A god could be anything, because a god was the memory of everything. Sereth was no longer a god — the divinity had been leaking out of her for three centuries, a slow diminishment she could feel with each decade. But the ability to remember a different body — to reach into the fading archive of what she had been and select a different shape — that remained. Diminished. Costly. Each change took more than the last.</w:t>
       </w:r>
     </w:p>
     <w:p>
@@ -4847,7 +4871,7 @@
           <w:rFonts w:ascii="Georgia" w:hAnsi="Georgia"/>
           <w:sz w:val="24"/>
         </w:rPr>
-        <w:t>Sereth needed to reach her first. Needed to prepare the ground. Not with explanations — Laine would not accept explanations. With a letter. A single sentence, left in a place Laine would find it, written in a hand she would not recognize but in a tone she would trust because the tone carried the specific quality of someone who understood grief and was asking her to carry more of it anyway.</w:t>
+        <w:t>Sereth needed to reach her first. Needed to prepare the ground. Not with explanations — Laine would not accept explanations. With a letter. A single sentence, left in a place Laine would find it, written in a hand she would not recognize but in a tone she would trust because the tone carried the quality of someone who understood grief and was asking her to carry more of it anyway.</w:t>
       </w:r>
     </w:p>
     <w:p>
@@ -5106,31 +5130,31 @@
           <w:rFonts w:ascii="Georgia" w:hAnsi="Georgia"/>
           <w:sz w:val="24"/>
         </w:rPr>
-        <w:t>They found it where the elder woman had said they would — at the Canopy's southern edge, where the trees thinned and the soil grew rocky and the whispers in the wood faded to a murmur and then to silence, the specific silence of a forest ending, of wood giving way to stone and the living memory of growth being replaced by the older, slower, infinitely more patient memory of mineral and pressure and the long geological conversation that stone conducts with itself across millennia. The entrance was concealed beneath a shelf of granite overgrown with Canopy creeper — thick, woody vines that had spent a century reclaiming the stonework, threading through mortar joints and prying apart the fitted blocks with the gentle, implacable persistence of living things.</w:t>
-      </w:r>
-    </w:p>
-    <w:p>
-      <w:pPr>
-        <w:ind w:firstLine="720"/>
-      </w:pPr>
-      <w:r>
-        <w:rPr>
-          <w:rFonts w:ascii="Georgia" w:hAnsi="Georgia"/>
-          <w:sz w:val="24"/>
-        </w:rPr>
-        <w:t>Jalo found it by touch. Not by the Know — by memory, the mortal kind, the unremarkable human ability to recall a place you have been before and navigate back to it by the feel of the ground beneath your feet and the angle of the light through the trees and the particular quality of silence that distinguishes one stretch of forest from another. He placed his palm on the granite shelf and his fingers — numb at the tips, the Mold's price still collecting, the sensation ending at the second knuckle where the living nerve met the dead — found a groove in the stone that was not natural. A carved channel, thumb-width, running the length of the shelf and terminating at a seam that was invisible to the eye but legible to the hand.</w:t>
-      </w:r>
-    </w:p>
-    <w:p>
-      <w:pPr>
-        <w:ind w:firstLine="720"/>
-      </w:pPr>
-      <w:r>
-        <w:rPr>
-          <w:rFonts w:ascii="Georgia" w:hAnsi="Georgia"/>
-          <w:sz w:val="24"/>
-        </w:rPr>
-        <w:t>"Here," he said. He pressed. The seam widened — not mechanically but organically, the stone remembering a different configuration the way a muscle remembers a stretch, the fitted blocks separating along lines that had been established by a Molder decades ago and that the stone had maintained in its mineral memory ever since. The shelf split. Beneath it: darkness, and the smell of deep earth — wet stone, mineral dust, the cold exhalation of a space that had not breathed surface air in years.</w:t>
+        <w:t>They found it where the elder woman had said they would — at the Canopy's southern edge, where the trees thinned and the soil grew rocky and the whispers in the wood faded to a murmur and then to silence, the silence of a forest ending, of wood giving way to stone and the living memory of growth being replaced by the older, slower, infinitely more patient memory of mineral and pressure and the long geological conversation that stone conducts with itself across millennia. The entrance was concealed beneath a shelf of granite overgrown with Canopy creeper — thick, woody vines that had spent a century reclaiming the stonework, threading through mortar joints and prying apart the fitted blocks with the gentle, implacable persistence of living things.</w:t>
+      </w:r>
+    </w:p>
+    <w:p>
+      <w:pPr>
+        <w:ind w:firstLine="720"/>
+      </w:pPr>
+      <w:r>
+        <w:rPr>
+          <w:rFonts w:ascii="Georgia" w:hAnsi="Georgia"/>
+          <w:sz w:val="24"/>
+        </w:rPr>
+        <w:t>Jalo found it by touch. Not by the Know — by memory, the mortal kind, the unremarkable human ability to recall a place you have been before and navigate back to it by the feel of the ground beneath your feet and the angle of the light through the trees and the particular quality of silence that distinguishes one stretch of forest from another. He placed his palm on the granite shelf and his fingers, numb at the tips, the sensation ending at the second knuckle where the living nerve met the dead, found a groove in the stone that was not natural. A carved channel, thumb-width, running the length of the shelf and terminating at a seam that was invisible to the eye but legible to the hand.</w:t>
+      </w:r>
+    </w:p>
+    <w:p>
+      <w:pPr>
+        <w:ind w:firstLine="720"/>
+      </w:pPr>
+      <w:r>
+        <w:rPr>
+          <w:rFonts w:ascii="Georgia" w:hAnsi="Georgia"/>
+          <w:sz w:val="24"/>
+        </w:rPr>
+        <w:t>"Here," he said. He pressed. The seam widened — not mechanically but organically, the stone remembering a different configuration, the fitted blocks separating along lines that had been established by a Molder decades ago and that the stone had maintained in its mineral memory ever since. The shelf split. Beneath it: darkness, and the smell of deep earth — wet stone, mineral dust, the cold exhalation of a space that had not breathed surface air in years.</w:t>
       </w:r>
     </w:p>
     <w:p>
@@ -5154,7 +5178,7 @@
           <w:rFonts w:ascii="Georgia" w:hAnsi="Georgia"/>
           <w:sz w:val="24"/>
         </w:rPr>
-        <w:t>"How far down?" Aelo asked. The darkness below was absolute. Not the darkness of night, which carries the memory of the day that preceded it and the anticipation of the dawn that will follow. This was the darkness of depth — permanent, structural, the darkness of a place that has never known light and does not miss it.</w:t>
+        <w:t>"How far down?" Aelo asked. The darkness below was absolute. Not the darkness of night. The darkness of depth: permanent, structural, a place that has never known light and does not miss it.</w:t>
       </w:r>
     </w:p>
     <w:p>
@@ -5216,43 +5240,31 @@
           <w:rFonts w:ascii="Georgia" w:hAnsi="Georgia"/>
           <w:sz w:val="24"/>
         </w:rPr>
-        <w:t>The transition happened in stages.</w:t>
-      </w:r>
-    </w:p>
-    <w:p>
-      <w:pPr>
-        <w:ind w:firstLine="720"/>
-      </w:pPr>
-      <w:r>
-        <w:rPr>
-          <w:rFonts w:ascii="Georgia" w:hAnsi="Georgia"/>
-          <w:sz w:val="24"/>
-        </w:rPr>
-        <w:t>First: the disappearance of the sky. The shaft narrowed above them as they descended, the circle of grey daylight shrinking from a window to a porthole to a coin to a pinprick to nothing, and then the darkness was complete and the only light was the faint amber pulse of Jalo's staff, held ahead of them like a lantern, the wood's embedded memory producing a warm, steady glow that illuminated three steps ahead and left everything else to the imagination.</w:t>
-      </w:r>
-    </w:p>
-    <w:p>
-      <w:pPr>
-        <w:ind w:firstLine="720"/>
-      </w:pPr>
-      <w:r>
-        <w:rPr>
-          <w:rFonts w:ascii="Georgia" w:hAnsi="Georgia"/>
-          <w:sz w:val="24"/>
-        </w:rPr>
-        <w:t>Second: the change in the air. Surface air carries the memory of weather — sun and wind and the accumulated thermal signature of a sky that changes by the hour. Underground air carries the memory of stone. It was cool, constant, heavy with mineral content, tasting of iron and limestone and the faint, sweet alkalinity of water that had been filtering through rock for centuries. Aelo breathed it and felt the world above recede — not vanish, but attenuate, the way a sound attenuates with distance, the emotional weather of the surface thinning as the stone thickened around them, each layer of rock adding another filter between his Know and the noise above.</w:t>
-      </w:r>
-    </w:p>
-    <w:p>
-      <w:pPr>
-        <w:ind w:firstLine="720"/>
-      </w:pPr>
-      <w:r>
-        <w:rPr>
-          <w:rFonts w:ascii="Georgia" w:hAnsi="Georgia"/>
-          <w:sz w:val="24"/>
-        </w:rPr>
-        <w:t xml:space="preserve">Third: the sound. Or rather, the absence of it, replaced by a presence. The Canopy had whispered — wood and wind and the vegetable conversation of living things. The Ming had hummed — the sustained, complex tone of the Elder Stone beneath the lake. The Core was silent in the way that very large things are silent — the silence of mass, of density, of a material so compacted by time and pressure that the individual memories within it had been fused into a single, undifferentiated continuum. The stone did not whisper. The stone did not hum. The stone </w:t>
+        <w:t>The sky went first. The shaft narrowed above them as they descended, the circle of grey daylight shrinking from a window to a porthole to a coin to a pinprick to nothing, and then the darkness was complete and the only light was the faint amber pulse of Jalo's staff, held ahead of them like a lantern, the wood's embedded memory producing a warm, steady glow that illuminated three steps ahead and left everything else to the imagination.</w:t>
+      </w:r>
+    </w:p>
+    <w:p>
+      <w:pPr>
+        <w:ind w:firstLine="720"/>
+      </w:pPr>
+      <w:r>
+        <w:rPr>
+          <w:rFonts w:ascii="Georgia" w:hAnsi="Georgia"/>
+          <w:sz w:val="24"/>
+        </w:rPr>
+        <w:t>Then the air changed. It was cool, constant, heavy with mineral content, tasting of iron and limestone and the faint, sweet alkalinity of water that had been filtering through rock for centuries. Aelo breathed it and felt the world above recede — not vanish, but attenuate, each layer of rock adding another filter between his Know and the noise above.</w:t>
+      </w:r>
+    </w:p>
+    <w:p>
+      <w:pPr>
+        <w:ind w:firstLine="720"/>
+      </w:pPr>
+      <w:r>
+        <w:rPr>
+          <w:rFonts w:ascii="Georgia" w:hAnsi="Georgia"/>
+          <w:sz w:val="24"/>
+        </w:rPr>
+        <w:t xml:space="preserve">Then the sound. Or rather, the absence of it, replaced by a presence. The Canopy had whispered, wood and wind and the vegetable conversation of living things. The Ming had hummed, the sustained tone of the Elder Stone beneath the lake. The Core was silent in the way that very large things are silent — the silence of mass, of density, of a material so compacted by time and pressure that the individual memories within it had been fused into a single, undifferentiated continuum. The stone did not whisper. The stone did not hum. The stone </w:t>
       </w:r>
       <w:r>
         <w:rPr>
@@ -5287,7 +5299,7 @@
           <w:rFonts w:ascii="Georgia" w:hAnsi="Georgia"/>
           <w:sz w:val="24"/>
         </w:rPr>
-        <w:t>Aelo held the lake stone tighter. The riverbed held. But the Core's mineral presence pressed against it from all sides — not aggressively, not the way the Ming lake had pressed, but with the patient, indifferent weight of something that did not care whether he was overwhelmed or not because it would continue to exist either way.</w:t>
+        <w:t>Aelo held the lake stone tighter. The riverbed held. But the Core's mineral presence pressed against it from all sides — without aggression, with the patient, indifferent weight of something that did not care whether he was overwhelmed or not because it would continue to exist either way.</w:t>
       </w:r>
     </w:p>
     <w:p>
@@ -5338,19 +5350,19 @@
           <w:rFonts w:ascii="Georgia" w:hAnsi="Georgia"/>
           <w:sz w:val="24"/>
         </w:rPr>
-        <w:t>"That's why the Mold is the hardest discipline to learn. The Know works through empathy — you feel what the world feels. The Mold requires you to speak to something that doesn't feel at all. Stone has memory, but it has no desire. To reshape it, you have to convince it that the shape you're offering is something it already was."</w:t>
-      </w:r>
-    </w:p>
-    <w:p>
-      <w:pPr>
-        <w:ind w:firstLine="720"/>
-      </w:pPr>
-      <w:r>
-        <w:rPr>
-          <w:rFonts w:ascii="Georgia" w:hAnsi="Georgia"/>
-          <w:sz w:val="24"/>
-        </w:rPr>
-        <w:t>The stairs ended. The shaft opened into a passage — broader, higher, the ceiling lost in darkness above them. The amber staff-light caught the walls and Aelo saw: carvings. Not decorative — structural. The passage walls had been Molded, the raw bedrock reshaped into smooth, fitted surfaces that joined at precise angles, the craftsmanship so fine that the seams between reshaped sections were invisible, the stone flowing from one surface to the next with the continuity of a thing that had always been this shape and had merely been waiting for someone to reveal it.</w:t>
+        <w:t>"That's why the Mold is the hardest discipline to learn. Stone has memory, but it has no desire. To reshape it, you have to convince it that the shape you're offering is something it already was."</w:t>
+      </w:r>
+    </w:p>
+    <w:p>
+      <w:pPr>
+        <w:ind w:firstLine="720"/>
+      </w:pPr>
+      <w:r>
+        <w:rPr>
+          <w:rFonts w:ascii="Georgia" w:hAnsi="Georgia"/>
+          <w:sz w:val="24"/>
+        </w:rPr>
+        <w:t>The stairs ended. The shaft opened into a passage — broader, higher, the ceiling lost in darkness above them. The amber staff-light caught the walls and Aelo saw: carvings. Not decorative. Structural. The passage walls had been Molded, the raw bedrock reshaped into smooth, fitted surfaces that joined at precise angles, the craftsmanship so fine that the seams between reshaped sections were invisible, the stone flowing from one surface to the next with the continuity of a thing that had always been this shape and had merely been waiting for someone to reveal it.</w:t>
       </w:r>
     </w:p>
     <w:p>
@@ -5413,7 +5425,7 @@
           <w:rFonts w:ascii="Georgia" w:hAnsi="Georgia"/>
           <w:sz w:val="24"/>
         </w:rPr>
-        <w:t>Not the amber glow of Jalo's staff. Not the blue-green bioluminescence of the Ming. Something else — warmer, richer, pulsing with a slow rhythm that was not mechanical but organic. The walls ahead glowed. Veins of crystal ran through the bedrock — thin, branching, luminous — producing a light that was the color of honey and firelight combined, a golden warmth that seemed to come from inside the stone itself, as if the rock were remembering a sun it had never seen.</w:t>
+        <w:t>Not Jalo's amber glow or the Ming's blue-green bioluminescence. Something warmer, richer, pulsing with a slow rhythm that was not mechanical but organic. The walls ahead glowed. Veins of crystal ran through the bedrock — thin, branching, luminous — producing a light that was the color of honey and firelight combined, a golden warmth that seemed to come from inside the stone itself, as if the rock were remembering a sun it had never seen.</w:t>
       </w:r>
     </w:p>
     <w:p>
@@ -5538,19 +5550,19 @@
           <w:rFonts w:ascii="Georgia" w:hAnsi="Georgia"/>
           <w:sz w:val="24"/>
         </w:rPr>
-        <w:t>The sound came first — a laugh, enormous, echoing through the cavern with the resonance of a sound produced by a chest cavity the size of a barrel and amplified by stone walls that had been unconsciously Molded over decades to carry one man's specific frequency. The laugh bounced off the columns and the bridges and the crystal-veined ceiling and arrived at Aelo's ears from six directions simultaneously, surrounding him in the sonic evidence of a man who was delighted and wanted the entire underground to know it.</w:t>
-      </w:r>
-    </w:p>
-    <w:p>
-      <w:pPr>
-        <w:ind w:firstLine="720"/>
-      </w:pPr>
-      <w:r>
-        <w:rPr>
-          <w:rFonts w:ascii="Georgia" w:hAnsi="Georgia"/>
-          <w:sz w:val="24"/>
-        </w:rPr>
-        <w:t xml:space="preserve">Then the man himself. Emerging from a side passage with the casual momentum of a boulder that has decided to roll — not fast, but unstoppable, the mass of him generating its own gravity. Torvus was the largest human being Aelo had ever seen. Not tall — not dramatically taller than Jalo — but </w:t>
+        <w:t>The sound came first — a laugh, enormous, echoing through the cavern with the resonance of a sound produced by a chest cavity the size of a barrel and amplified by stone walls that had been unconsciously Molded over decades to carry one man's frequency. The laugh bounced off the columns and the bridges and the crystal-veined ceiling and arrived at Aelo's ears from six directions simultaneously, surrounding him in the sonic evidence of a man who was delighted and wanted the entire underground to know it.</w:t>
+      </w:r>
+    </w:p>
+    <w:p>
+      <w:pPr>
+        <w:ind w:firstLine="720"/>
+      </w:pPr>
+      <w:r>
+        <w:rPr>
+          <w:rFonts w:ascii="Georgia" w:hAnsi="Georgia"/>
+          <w:sz w:val="24"/>
+        </w:rPr>
+        <w:t xml:space="preserve">Then the man himself. Emerging from a side passage with the casual momentum of a boulder that has decided to roll — not fast, but unstoppable, the mass of him generating its own gravity. Torvus was the largest human being Aelo had ever seen. Not dramatically taller than Jalo, but </w:t>
       </w:r>
       <w:r>
         <w:rPr>
@@ -5565,7 +5577,7 @@
           <w:rFonts w:ascii="Georgia" w:hAnsi="Georgia"/>
           <w:sz w:val="24"/>
         </w:rPr>
-        <w:t>. Wide the way a tree trunk is wide, the way a stone column is wide, the width of something that has been built to bear weight and has accepted the bearing as its defining characteristic. His shoulders were the width of a doorframe. His hands — and Aelo stared at the hands, because the hands were the story — were enormous, scarred, calloused, and held at his sides with the specific looseness of appendages that their owner could no longer feel.</w:t>
+        <w:t>. Wide the way a tree trunk is wide, the way a stone column is wide, the width of something that has been built to bear weight and has accepted the bearing as its defining characteristic. His shoulders were the width of a doorframe. His hands — and Aelo stared at the hands, because the hands were the story — were enormous, scarred, calloused, and held at his sides with the looseness of appendages that their owner could no longer feel.</w:t>
       </w:r>
     </w:p>
     <w:p>
@@ -5637,7 +5649,7 @@
           <w:rFonts w:ascii="Georgia" w:hAnsi="Georgia"/>
           <w:sz w:val="24"/>
         </w:rPr>
-        <w:t>"Your knee has been complaining for twenty years. It can complain from up here." Torvus held him a moment longer — the embrace of a man who measured affection in pounds of pressure — and then set Jalo down with a gentleness that contradicted everything about his size. "You look terrible."</w:t>
+        <w:t>"Your knee has been complaining for twenty years. It can complain from up here." Torvus held him a moment longer — the embrace of a man who measured affection in pounds of pressure, then set Jalo down with a gentleness that contradicted everything about his size. "You look terrible."</w:t>
       </w:r>
     </w:p>
     <w:p>
@@ -5915,7 +5927,7 @@
           <w:rFonts w:ascii="Georgia" w:hAnsi="Georgia"/>
           <w:sz w:val="24"/>
         </w:rPr>
-        <w:t>He set the figurine down. His face — that open, mobile, endlessly expressive face — held the grief the way the Core held its crystal light: visibly, without apology, without the architectural containment that the Ming would have applied or the defensive compression that Jalo would have used. Torvus grieved openly because openness was the Core's discipline, the way silence was the Ming's, and concealment would have been a failure of craft.</w:t>
+        <w:t>He set the figurine down. His face — that open, mobile, endlessly expressive face — held the grief visibly, without apology. Torvus grieved openly because openness was the Core's discipline, and concealment would have been a failure of craft.</w:t>
       </w:r>
     </w:p>
     <w:p>
@@ -5963,7 +5975,7 @@
           <w:rFonts w:ascii="Georgia" w:hAnsi="Georgia"/>
           <w:sz w:val="24"/>
         </w:rPr>
-        <w:t>Aelo took the pebble. He held it in his palm. He closed his eyes and reached for the stone the way the Ming had taught him to reach for a person's memory — with attention, with patience, with the specific quality of listening that the teacher at the lake had called the riverbed.</w:t>
+        <w:t>Aelo took the pebble. He held it in his palm. He closed his eyes and reached for the stone the way the Ming had taught him to reach for a person's memory — with attention, with patience, with the quality of listening that the teacher at the lake had called the riverbed.</w:t>
       </w:r>
     </w:p>
     <w:p>
@@ -6014,7 +6026,7 @@
           <w:rFonts w:ascii="Georgia" w:hAnsi="Georgia"/>
           <w:sz w:val="24"/>
         </w:rPr>
-        <w:t xml:space="preserve">." Torvus took the pebble back, held it between his thumb and forefinger — the grip visual, gauged by pressure he could not feel — and the stone changed. Flowed. Not like water — like a memory being revised, the shape softening from irregular to spherical in the span of a breath, the stone's surface smoothing as if it had always been smooth and had merely been waiting for permission to show it. A perfect sphere. Torvus held it up. "I didn't ask. I knew the shape. I saw it so clearly that the stone had no choice but to remember it. You have to </w:t>
+        <w:t xml:space="preserve">." Torvus took the pebble back, held it between his thumb and forefinger — the grip visual, gauged by pressure he could not feel. The stone changed. Flowed. Not like water — like a memory being revised, the shape softening from irregular to spherical in the span of a breath, the stone's surface smoothing as if it had always been smooth and had merely been waiting for permission to show it. A perfect sphere. Torvus held it up. "I didn't ask. I knew the shape. I saw it so clearly that the stone had no choice but to remember it. You have to </w:t>
       </w:r>
       <w:r>
         <w:rPr>
@@ -6103,7 +6115,7 @@
           <w:rFonts w:ascii="Georgia" w:hAnsi="Georgia"/>
           <w:sz w:val="24"/>
         </w:rPr>
-        <w:t xml:space="preserve">The Ming training did not help. The riverbed — the resolved depth, the luminous tone — was accessible, but it was a listener's skill, and listening was not what the Mold required. The Mold required speech. Command. The specific confidence of a mind that could look at a piece of the world and say: </w:t>
+        <w:t xml:space="preserve">The Ming training did not help. The riverbed — the resolved depth, the luminous tone — was accessible, but it was a listener's skill, and listening was not what the Mold required. The Mold required speech. Command. The confidence of a mind that could look at a piece of the world and say: </w:t>
       </w:r>
       <w:r>
         <w:rPr>
@@ -6540,7 +6552,7 @@
           <w:rFonts w:ascii="Georgia" w:hAnsi="Georgia"/>
           <w:sz w:val="24"/>
         </w:rPr>
-        <w:t>Jalo stood in the passage behind them. He had been watching too — Aelo could feel the man's emotional weather from twenty feet away, the complex mixture of pride and fear and the specific, sharp-edged hope of a guardian who has just watched his charge do something that changes the shape of the possible.</w:t>
+        <w:t>Jalo stood in the passage behind them. He had been watching too — Aelo could feel the man's emotional weather from twenty feet away, the complex mixture of pride and fear and the sharp-edged hope of a guardian who has just watched his charge do something that changes the shape of the possible.</w:t>
       </w:r>
     </w:p>
     <w:p>
@@ -6904,7 +6916,7 @@
           <w:rFonts w:ascii="Georgia" w:hAnsi="Georgia"/>
           <w:sz w:val="24"/>
         </w:rPr>
-        <w:t xml:space="preserve"> thing he had ever seen. Beautiful. The word supplied itself, and the word was correct, but the word was a label, not a memory. The nine-year-old boy who had looked up at a blue bird on a branch and felt his chest expand with something he had no name for — that boy was becoming a silhouette. Backlit. The posture was there. The outline was recognizable. But the face was in shadow, and the expression on the face — the specific, unrepeatable expression of a child encountering beauty for the first time and being changed by the encounter — was gone. Burned away. The details consumed by a process that did not discriminate between the important and the trivial, that ate memory the way fire eats wood: from the edges inward, the extremities first, the center last.</w:t>
+        <w:t xml:space="preserve"> thing he had ever seen. Beautiful. The word supplied itself, and the word was correct, but the word was a label, not a memory. The nine-year-old boy who had looked up at a blue bird on a branch and felt his chest expand with something he had no name for — that boy was becoming a silhouette. Backlit. The posture was there. The outline was recognizable. But the face was in shadow, and the expression on the face — the unrepeatable expression of a child encountering beauty for the first time and being changed by the encounter — was gone. Burned away. The details consumed by a process that did not discriminate between the important and the trivial, that ate memory the way fire eats wood: from the edges inward, the extremities first, the center last.</w:t>
       </w:r>
     </w:p>
     <w:p>
@@ -7294,7 +7306,7 @@
           <w:rFonts w:ascii="Georgia" w:hAnsi="Georgia"/>
           <w:sz w:val="24"/>
         </w:rPr>
-        <w:t>, and the note had been — not beautiful. Not terrible. Complete. The note had been complete in the way that nothing in his life had ever been complete. It contained everything. Every frequency. Every memory. Every iteration of warmth and light and the specific quality of being part of something that The Knife had never felt before and had felt, in that moment, for half a second, before the Stone sealed and the note ended and the boy was carried out and the world returned to its usual state of fragmentation.</w:t>
+        <w:t>, and the note had been — not beautiful. Not terrible. Complete. The note had been complete in the way that nothing in his life had ever been complete. It contained everything. Every frequency. Every memory. Every iteration of warmth and light and the quality of being part of something that The Knife had never felt before and had felt, in that moment, for half a second, before the Stone sealed and the note ended and the boy was carried out and the world returned to its usual state of fragmentation.</w:t>
       </w:r>
     </w:p>
     <w:p>
@@ -7606,7 +7618,7 @@
           <w:rFonts w:ascii="Georgia" w:hAnsi="Georgia"/>
           <w:sz w:val="24"/>
         </w:rPr>
-        <w:t>They were in the lower galleries — a section of the underground city that had been abandoned decades ago, the corridors dark, the crystal veins dim, the stone carrying the specific emotional residue that Aelo's Know registered as absence. Not emptiness — absence. The people who had lived in these galleries had not chosen to leave. They had been sealed in, or sealed out, when Varas collapsed the main shafts and the underground cities became tombs for those who would not surrender and prisons for those who could not escape.</w:t>
+        <w:t>They were in the lower galleries — a section of the underground city that had been abandoned decades ago, the corridors dark, the crystal veins dim, the stone carrying the emotional residue that Aelo's Know registered as absence. Not emptiness — absence. The people who had lived in these galleries had not chosen to leave. They had been sealed in, or sealed out, when Varas collapsed the main shafts and the underground cities became tombs for those who would not surrender and prisons for those who could not escape.</w:t>
       </w:r>
     </w:p>
     <w:p>
@@ -7657,19 +7669,19 @@
           <w:rFonts w:ascii="Georgia" w:hAnsi="Georgia"/>
           <w:sz w:val="24"/>
         </w:rPr>
-        <w:t xml:space="preserve"> — found inside the stone's memory and drawn out the way a sculptor draws a figure from marble by removing everything that is not the figure. The surface was not smooth — it was textured, deliberately, the stone's grain preserved and accentuated, the natural striations of the granite highlighted the way a sculptor highlights the veins in marble, working with the material rather than against it. The crystal veins in the surrounding walls pulsed with golden warmth, responding to the Mold's lingering presence the way a tuning fork continues to hum after the strike that set it singing.</w:t>
-      </w:r>
-    </w:p>
-    <w:p>
-      <w:pPr>
-        <w:ind w:firstLine="720"/>
-      </w:pPr>
-      <w:r>
-        <w:rPr>
-          <w:rFonts w:ascii="Georgia" w:hAnsi="Georgia"/>
-          <w:sz w:val="24"/>
-        </w:rPr>
-        <w:t>The arch was beautiful. Not beautiful the way a painting is beautiful, or a sunset, or a face. Beautiful the way a truth is beautiful — structurally, inevitably, the beauty arising not from decoration but from the absolute correctness of the form. The arch looked like it had always been there. It looked like the passage had been waiting, for decades, for someone to remind the rubble that it knew how to be an opening.</w:t>
+        <w:t xml:space="preserve"> — found inside the stone's memory and drawn out the way a sculptor draws a figure from marble by removing everything that is not the figure. The surface was not smooth — it was textured, deliberately, the stone's grain preserved and accentuated, the natural striations of the granite highlighted, working with the material rather than against it. The crystal veins in the surrounding walls pulsed with golden warmth, responding to the Mold's lingering presence the way a tuning fork continues to hum after the strike that set it singing.</w:t>
+      </w:r>
+    </w:p>
+    <w:p>
+      <w:pPr>
+        <w:ind w:firstLine="720"/>
+      </w:pPr>
+      <w:r>
+        <w:rPr>
+          <w:rFonts w:ascii="Georgia" w:hAnsi="Georgia"/>
+          <w:sz w:val="24"/>
+        </w:rPr>
+        <w:t>The arch was beautiful. Not beautiful the way a painting is beautiful, or a sunset, or a face. Beautiful the way a truth is beautiful. Structurally, inevitably, the beauty arising not from decoration but from the absolute correctness of the form. The arch looked like it had always been there. It looked like the passage had been waiting, for decades, for someone to remind the rubble that it knew how to be an opening.</w:t>
       </w:r>
     </w:p>
     <w:p>
@@ -7717,7 +7729,7 @@
           <w:rFonts w:ascii="Georgia" w:hAnsi="Georgia"/>
           <w:sz w:val="24"/>
         </w:rPr>
-        <w:t>"Every magic costs," Torvus said. "The Know costs self — you absorb what you read, and eventually you can't tell which feelings are yours. The Heal costs pain — you carry the memory of every wound you mend. The Move costs place — you lose your sense of where you are." He looked at Aelo. The bright eyes — the last fully alive things in his body — held the specific clarity of a man who has paid a price he does not regret and wants the boy to understand both the price and the not-regretting. "The Mold costs touch. You speak to stone, and stone answers, and every answer costs you a piece of the body's memory of being touched. The question isn't whether you'll pay. The question is what you're willing to buy."</w:t>
+        <w:t>"Every magic costs," Torvus said. He looked at Aelo. The bright eyes — the last fully alive things in his body — held the clarity of a man who has paid a price he does not regret and wants the boy to understand both the price and the not-regretting. "The Mold costs touch. You speak to stone, and stone answers, and every answer costs you a piece of the body's memory of being touched. The question isn't whether you'll pay. The question is what you're willing to buy."</w:t>
       </w:r>
     </w:p>
     <w:p>
@@ -7791,7 +7803,7 @@
           <w:rFonts w:ascii="Georgia" w:hAnsi="Georgia"/>
           <w:sz w:val="24"/>
         </w:rPr>
-        <w:t>The first time — the brick, a simple reshaping, asking the fired clay to remember the smooth slab it had been before the kiln — the feeling of the stone floor under his feet went dim. The iron taste flickered — brief, involuntary, the shadow-anger that rose whenever something was taken from him. Not gone — dim. As if someone had placed a thin cloth between his soles and the ground, the texture still there but muffled, the temperature still present but attenuated. He stopped. He looked at his feet. The feet were fine — unchanged, uninjured, the skin intact. But the sensation was reduced, and the reduction had happened in the instant the brick changed shape, the cost collected at the moment of success.</w:t>
+        <w:t>The first time — the brick, a simple reshaping, asking the fired clay to remember the smooth slab it had been before the kiln — the feeling of the stone floor under his feet went dim. The iron taste flickered — brief, involuntary, the shadow-anger that rose whenever something was taken from him. Not gone. Dim. As if someone had placed a thin cloth between his soles and the ground, the texture still there but muffled, the temperature still present but attenuated. He stopped. He looked at his feet. The feet were fine — unchanged, uninjured, the skin intact. But the sensation was reduced, and the reduction had happened in the instant the brick changed shape, the cost collected at the moment of success.</w:t>
       </w:r>
     </w:p>
     <w:p>
@@ -7949,7 +7961,7 @@
           <w:rFonts w:ascii="Georgia" w:hAnsi="Georgia"/>
           <w:sz w:val="24"/>
         </w:rPr>
-        <w:t>"Some of them. The Core people are resilient — we were built for enclosed spaces, for darkness, for survival on fungus and recycled water and the specific stubbornness that living underground produces. They had mushroom gardens. They had an underground spring. They had Molders who could reshape the stone to create ventilation channels that drew air from cracks too small for a person but large enough for atmosphere." Torvus's voice held something that Aelo's Know could feel but that Torvus's face did not show — a controlled grief, a fury held in place by decades of living with a fact that was too large to express and too permanent to resolve. "They are alive. They have been alive for eighteen years in a space that was meant to kill them, and they have survived because the Core does not surrender to stone. The Core speaks to stone. And the stone, if you speak to it correctly, listens."</w:t>
+        <w:t>"Some of them. The Core people are resilient — we were built for enclosed spaces, for darkness, for survival on fungus and recycled water and the specific stubbornness that living underground produces. They had mushroom gardens. They had an underground spring. They had Molders who could reshape the stone to create ventilation channels that drew air from cracks too small for a person but large enough for atmosphere." Torvus's voice held something that Aelo's Know could feel but that Torvus's face did not show: a controlled grief, a fury held in place by decades of living with a fact that was too large to express and too permanent to resolve. "They are alive. They have been alive for eighteen years in a space that was meant to kill them, and they have survived because the Core does not surrender to stone. The Core speaks to stone. And the stone, if you speak to it correctly, listens."</w:t>
       </w:r>
     </w:p>
     <w:p>
@@ -8095,7 +8107,7 @@
           <w:rFonts w:ascii="Georgia" w:hAnsi="Georgia"/>
           <w:sz w:val="24"/>
         </w:rPr>
-        <w:t xml:space="preserve"> the difference between hearing music and hearing that music is playing. His forearms went next — the warmth of the air, the cool of the stone, the constant low-grade sensory data that the body produces to confirm that it exists in space — muffled, as if his arms had been wrapped in cloth. The cost was steep. The Mold was enormous — not a pebble, not a brick, not a wall. A mountain's worth of stone, being asked to remember a shape it had been forbidden to hold for eighteen years.</w:t>
+        <w:t xml:space="preserve"> the difference between hearing music and hearing that music is playing. His forearms went next — the warmth of the air, the cool of the stone, the constant low-grade sensory data that the body produces to confirm that it exists in space — muffled, as if his arms had been wrapped in cloth. The cost was steep. The Mold was enormous — not a pebble or a brick or a wall. A mountain's worth of stone, being asked to remember a shape it had been forbidden to hold for eighteen years.</w:t>
       </w:r>
     </w:p>
     <w:p>
@@ -8200,19 +8212,19 @@
           <w:rFonts w:ascii="Georgia" w:hAnsi="Georgia"/>
           <w:sz w:val="24"/>
         </w:rPr>
-        <w:t>The passage opened. The rubble separated. The air that came through was stale and warm and carried the specific human density of a space that had been lived in for eighteen years without ventilation — the accumulated breath of hundreds of people, the metabolic signature of survival, the smell of mushroom gardens and recycled water and the particular, unmistakable scent of human beings who have been waiting for a very long time and have not stopped hoping.</w:t>
-      </w:r>
-    </w:p>
-    <w:p>
-      <w:pPr>
-        <w:ind w:firstLine="720"/>
-      </w:pPr>
-      <w:r>
-        <w:rPr>
-          <w:rFonts w:ascii="Georgia" w:hAnsi="Georgia"/>
-          <w:sz w:val="24"/>
-        </w:rPr>
-        <w:t>Light came through — faint, bioluminescent, the crystal veins on the other side still producing their golden warmth after eighteen years of isolation, the stone's memory of light sustained by the people who had maintained the crystals the way you maintain a fire, feeding them with Mold magic, keeping the memory alive because the alternative was darkness and darkness in the Core was not the absence of light but the absence of the stone's voice, and the stone's voice was the only thing that had kept them sane.</w:t>
+        <w:t>The passage opened. The rubble separated. The air that came through was stale and warm and carried the human density of a space that had been lived in for eighteen years without ventilation — the accumulated breath of hundreds of people, the metabolic signature of survival, the smell of mushroom gardens and recycled water and the particular, unmistakable scent of human beings who have been waiting for a very long time and have not stopped hoping.</w:t>
+      </w:r>
+    </w:p>
+    <w:p>
+      <w:pPr>
+        <w:ind w:firstLine="720"/>
+      </w:pPr>
+      <w:r>
+        <w:rPr>
+          <w:rFonts w:ascii="Georgia" w:hAnsi="Georgia"/>
+          <w:sz w:val="24"/>
+        </w:rPr>
+        <w:t>Light came through — faint, bioluminescent, the crystal veins on the other side still producing their golden warmth after eighteen years of isolation, the stone's memory of light sustained by the people who had fed the crystals with Mold magic, keeping the memory alive because the alternative was darkness and darkness in the Core was not the absence of light but the absence of the stone's voice, and the stone's voice was the only thing that had kept them sane.</w:t>
       </w:r>
     </w:p>
     <w:p>
@@ -8248,31 +8260,31 @@
           <w:rFonts w:ascii="Georgia" w:hAnsi="Georgia"/>
           <w:sz w:val="24"/>
         </w:rPr>
-        <w:t>Aelo reached through the opening. His hands — numb now, the sensation gone from fingertips to wrists, the Mold's price collected in full — extended toward the nearest child. A girl, six or seven, her face pale as limestone, her eyes adapted to the crystal light, her expression the expression of a child who has been told that someday the wall will open and who has believed this with the specific, undefended faith of a child and is now watching the belief become a fact.</w:t>
-      </w:r>
-    </w:p>
-    <w:p>
-      <w:pPr>
-        <w:ind w:firstLine="720"/>
-      </w:pPr>
-      <w:r>
-        <w:rPr>
-          <w:rFonts w:ascii="Georgia" w:hAnsi="Georgia"/>
-          <w:sz w:val="24"/>
-        </w:rPr>
-        <w:t>She took his hands. He could not feel her grip. The numbness was complete — the hands that had held the lake stone, that had rounded the pebble, that had pressed against the wall of collapsed stone and reminded it of the passage it had been — were silent now, the sensory nerves quieted by the Mold's cost, the body's memory of being touched traded for the stone's memory of being open.</w:t>
-      </w:r>
-    </w:p>
-    <w:p>
-      <w:pPr>
-        <w:ind w:firstLine="720"/>
-      </w:pPr>
-      <w:r>
-        <w:rPr>
-          <w:rFonts w:ascii="Georgia" w:hAnsi="Georgia"/>
-          <w:sz w:val="24"/>
-        </w:rPr>
-        <w:t>But he could feel her relief. Through the Know — through the discipline that did not require touch, that operated in the emotional spectrum rather than the physical, that could read a human heart from across a room — her relief poured into him. And behind her, through the opening, the relief of hundreds — a wave, a tide, the accumulated hope of eighteen years breaking against the wall of rubble and pouring through the gap and filling the passage with the specific, overwhelming, unbearable brightness of people who have been saved and who know they have been saved.</w:t>
+        <w:t>Aelo reached through the opening. His hands — numb now, the sensation gone from fingertips to wrists, the Mold's price collected in full — extended toward the nearest child. A girl, six or seven, her face pale as limestone, her eyes adapted to the crystal light, her expression the expression of a child who has been told that someday the wall will open and who has believed this with the undefended faith of a child and is now watching the belief become a fact.</w:t>
+      </w:r>
+    </w:p>
+    <w:p>
+      <w:pPr>
+        <w:ind w:firstLine="720"/>
+      </w:pPr>
+      <w:r>
+        <w:rPr>
+          <w:rFonts w:ascii="Georgia" w:hAnsi="Georgia"/>
+          <w:sz w:val="24"/>
+        </w:rPr>
+        <w:t>She took his hands. He could not feel her grip. The numbness was complete — the hands that had held the lake stone and rounded the pebble and pressed against the wall of collapsed stone and reminded it of the passage it had been — were silent now, the sensory nerves quieted by the Mold's cost, the body's memory of being touched traded for the stone's memory of being open.</w:t>
+      </w:r>
+    </w:p>
+    <w:p>
+      <w:pPr>
+        <w:ind w:firstLine="720"/>
+      </w:pPr>
+      <w:r>
+        <w:rPr>
+          <w:rFonts w:ascii="Georgia" w:hAnsi="Georgia"/>
+          <w:sz w:val="24"/>
+        </w:rPr>
+        <w:t>But he could feel her relief. Through the Know — through the discipline that did not require touch, that operated in the emotional spectrum rather than the physical, that could read a human heart from across a room — her relief poured into him. And behind her, through the opening, the relief of hundreds — a wave, a tide, the accumulated hope of eighteen years breaking against the wall of rubble and pouring through the gap and filling the passage with the overwhelming, unbearable brightness of people who have been saved and who know they have been saved.</w:t>
       </w:r>
     </w:p>
     <w:p>
@@ -8296,7 +8308,7 @@
           <w:rFonts w:ascii="Georgia" w:hAnsi="Georgia"/>
           <w:sz w:val="24"/>
         </w:rPr>
-        <w:t>Jalo stood behind Torvus. His face was unwrapped. Both eyes — the clear one and the lidded one — were fixed on Aelo. His emotional weather, which Aelo could read from twenty feet through stone: pride. And fear. And the specific, sharp-edged recognition of a man who has just watched his charge do something that changes the shape of the possible.</w:t>
+        <w:t>Jalo stood behind Torvus. His face was unwrapped. Both eyes — the clear one and the lidded one — were fixed on Aelo. His emotional weather, which Aelo could read from twenty feet through stone: pride. And fear. And the sharp-edged recognition of a man who has just watched his charge do something that changes the shape of the possible.</w:t>
       </w:r>
     </w:p>
     <w:p>
@@ -8382,19 +8394,7 @@
           <w:rFonts w:ascii="Georgia" w:hAnsi="Georgia"/>
           <w:sz w:val="24"/>
         </w:rPr>
-        <w:t>And this was the thing that sat in him as he sat in the workshop and listened to the crystal light pulse and the distant sounds of reunion carry through the stone: his magic was not in any one discipline.</w:t>
-      </w:r>
-    </w:p>
-    <w:p>
-      <w:pPr>
-        <w:ind w:firstLine="720"/>
-      </w:pPr>
-      <w:r>
-        <w:rPr>
-          <w:rFonts w:ascii="Georgia" w:hAnsi="Georgia"/>
-          <w:sz w:val="24"/>
-        </w:rPr>
-        <w:t xml:space="preserve">The Ming had taught him the Know — to listen, to descend, to find the riverbed. Torvus had taught him the Mold — to speak to stone, to remind it of what it had been. But what he had done at the sealed passage was neither. He had listened to the stone the way a Knower listens to a person — with empathy, with attention, with the specific quality of care that the Ming called curation. And he had spoken to it the way a Molder speaks to material — with conviction, with knowing, with the unhedged certainty that the shape he was offering was real. He had used the Know to hear what the stone wanted to be and the Mold to help it become that thing, and the two disciplines had not operated separately — they had </w:t>
+        <w:t xml:space="preserve">And this was the thing that sat in him as he sat in the workshop and listened to the crystal light pulse and the distant sounds of reunion carry through the stone: at the sealed passage, the Know and the Mold had not operated separately. They had </w:t>
       </w:r>
       <w:r>
         <w:rPr>
@@ -8441,46 +8441,7 @@
           <w:rFonts w:ascii="Georgia" w:hAnsi="Georgia"/>
           <w:sz w:val="24"/>
         </w:rPr>
-        <w:t>Two of seven. He had harmonized two. The Know and the Mold, working together, producing something that Torvus — forty years a Molder, the finest craftsman in the Core — had never seen. Not because the combination was complex. Because no one had thought to try it. The disciplines were taught separately, practiced separately, conceived as distinct languages spoken by distinct peoples in distinct regions. No one combined them because no one had been trained in more than one. No one had been taught to listen with the Know while speaking with the Mold.</w:t>
-      </w:r>
-    </w:p>
-    <w:p>
-      <w:pPr>
-        <w:ind w:firstLine="720"/>
-      </w:pPr>
-      <w:r>
-        <w:rPr>
-          <w:rFonts w:ascii="Georgia" w:hAnsi="Georgia"/>
-          <w:sz w:val="24"/>
-        </w:rPr>
-        <w:t xml:space="preserve">Except Aelo's. Aelo's lesson was: </w:t>
-      </w:r>
-      <w:r>
-        <w:rPr>
-          <w:rFonts w:ascii="Georgia" w:hAnsi="Georgia"/>
-          <w:i/>
-          <w:sz w:val="24"/>
-        </w:rPr>
-        <w:t>listen first</w:t>
-      </w:r>
-      <w:r>
-        <w:rPr>
-          <w:rFonts w:ascii="Georgia" w:hAnsi="Georgia"/>
-          <w:sz w:val="24"/>
-        </w:rPr>
-        <w:t>. Always. To everything. Because listening was not a single discipline — it was the foundation beneath all of them, the riverbed on which every voice rested, and if you could hear the riverbed, you could hear all the voices at once, and if you could hear them all at once, you could sing.</w:t>
-      </w:r>
-    </w:p>
-    <w:p>
-      <w:pPr>
-        <w:ind w:firstLine="720"/>
-      </w:pPr>
-      <w:r>
-        <w:rPr>
-          <w:rFonts w:ascii="Georgia" w:hAnsi="Georgia"/>
-          <w:sz w:val="24"/>
-        </w:rPr>
-        <w:t>He did not understand this yet. Not fully. The understanding was forming the way the passage had formed — slowly, through compressed memory being reminded of its original shape. The architecture was emerging. And somewhere inside it, in a room that was growing larger with each discipline he learned and each cost he paid, the Song was getting louder.</w:t>
+        <w:t>Two of seven. And somewhere inside him, in a room that was growing larger with each discipline he learned and each cost he paid, the Song was getting louder.</w:t>
       </w:r>
     </w:p>
     <w:p>
@@ -8748,7 +8709,7 @@
           <w:rFonts w:ascii="Georgia" w:hAnsi="Georgia"/>
           <w:sz w:val="24"/>
         </w:rPr>
-        <w:t>Not loudest in volume — the Canopy's whispers had been louder in the aggregate, the Ming lake's hum more pervasive, the Core's silence more overwhelming. Kasuum was loud in the way that purpose is loud. Every sound was intentional. The ring of hammer on anvil — not one hammer, not ten, but hundreds, the percussion overlapping into a continuous, arrhythmic roar that rose from the caldera floor like heat from a fire. The hiss of quenching — hot metal plunged into troughs of dark water, the steam erupting in white columns that caught the forge-light and turned it into amber pillars. The rumble of bellows — enormous, worked by teams of four, the lungs of the city pumping air into furnaces that had been burning continuously for generations, the fire fed by coal and Burn magic and the specific, collective will of a people who had made the forge the center of their civilization the way the Ming had made the lake the center of theirs.</w:t>
+        <w:t>Not loudest in volume — the Canopy's whispers had been louder in the aggregate, the Ming lake's hum more pervasive, the Core's silence more overwhelming. Kasuum was loud in the way that purpose is loud. Every sound was intentional. The ring of hammer on anvil — not one hammer, not ten, but hundreds, the percussion overlapping into a continuous, arrhythmic roar that rose from the caldera floor like heat from a fire. The hiss of quenching — hot metal plunged into troughs of dark water, the steam erupting in white columns that caught the forge-light and turned it into amber pillars. The rumble of bellows — enormous, worked by teams of four, the lungs of the city pumping air into furnaces that had been burning continuously for generations, the fire fed by coal and Burn magic and the collective will of a people who had made the forge the center of their civilization the way the Ming had made the lake the center of theirs.</w:t>
       </w:r>
     </w:p>
     <w:p>
@@ -8784,7 +8745,7 @@
           <w:rFonts w:ascii="Georgia" w:hAnsi="Georgia"/>
           <w:sz w:val="24"/>
         </w:rPr>
-        <w:t>This was worse than cruelty. Aelo felt this without articulating it — a recognition that settled in his chest with the specific, uncomfortable weight of a truth that does not have the decency to be dramatic. Cruelty could be identified. This — the forge, the hammers, the ordinary people making extraordinary weapons for a regime that would use them to drain children and seal cities and hunt boys through forests — this had no center. It was a system. The system ran because each part did its job and no part looked at the whole.</w:t>
+        <w:t>This was worse than cruelty. Aelo felt this without articulating it — a recognition that settled in his chest with the uncomfortable weight of a truth that does not have the decency to be dramatic. Cruelty could be identified. This — the forge, the hammers, the ordinary people making extraordinary weapons for a regime that would use them to drain children and seal cities and hunt boys through forests — this had no center. It was a system. The system ran because each part did its job and no part looked at the whole.</w:t>
       </w:r>
     </w:p>
     <w:p>
@@ -8846,7 +8807,7 @@
           <w:rFonts w:ascii="Georgia" w:hAnsi="Georgia"/>
           <w:sz w:val="24"/>
         </w:rPr>
-        <w:t>The smith was young — mid-twenties, Aelo estimated, though the Volcano People aged slowly in the heat, their skin thickening rather than wrinkling, the years registering as density rather than fragility. He was shirtless, his torso dark and gleaming, the muscles defined not by vanity but by function — the specific musculature of a man who had spent a decade swinging a hammer with one arm and holding tongs with the other, the bilateral asymmetry of a body shaped by its labor. His face was focused, calm, the expression of a craftsman in the center of his craft: entirely present, entirely absorbed, the world outside the forge reduced to background noise by the intensity of attention that the work demanded.</w:t>
+        <w:t>The smith was young — mid-twenties, Aelo estimated, though the Volcano People aged slowly in the heat, their skin thickening rather than wrinkling, the years registering as density rather than fragility. He was shirtless, his torso dark and gleaming, the muscles defined not by vanity but by function — the musculature of a man who had spent a decade swinging a hammer with one arm and holding tongs with the other, the bilateral asymmetry of a body shaped by its labor. His face was focused, calm, the expression of a craftsman in the center of his craft: entirely present, entirely absorbed, the world outside the forge reduced to background noise by the intensity of attention that the work demanded.</w:t>
       </w:r>
     </w:p>
     <w:p>
@@ -9119,7 +9080,7 @@
           <w:rFonts w:ascii="Georgia" w:hAnsi="Georgia"/>
           <w:sz w:val="24"/>
         </w:rPr>
-        <w:t>Jalo's hand closed on his elbow — the grip firm, urgent, the specific pressure of a guardian who has identified a threat to his charge's cover and is executing the extraction protocol. "We need to go."</w:t>
+        <w:t>Jalo's hand closed on his elbow — the grip firm, urgent, the pressure of a guardian who has identified a threat to his charge's cover and is executing the extraction protocol. "We need to go."</w:t>
       </w:r>
     </w:p>
     <w:p>
@@ -9333,7 +9294,7 @@
           <w:rFonts w:ascii="Georgia" w:hAnsi="Georgia"/>
           <w:sz w:val="24"/>
         </w:rPr>
-        <w:t>. Every other memory he had encountered — the Canopy's whispers, the Ming lake's hum, the Core's bass presence, the Volcano's infrared vibration — had been built on top of this. The Sea's memory was not a layer. It was the ground beneath all layers. The first water. The first instance of a thing being alive in a world that had, until that moment, been only stone and heat and the long, patient silence of minerals waiting. Life had begun here. Life remembered beginning here. And the ocean, which had been the cradle, still carried the cradle's memory — the warmth of it, the salt of it, the specific, irreducible quality of a medium in which the first cell had divided and the first organism had swum and the first creature had crawled toward a shore that it could not see but could somehow feel, guided by a trajectory that was older than instinct and deeper than thought.</w:t>
+        <w:t>. Every other memory he had encountered — the Canopy's whispers, the Ming lake's hum, the Core's bass presence, the Volcano's infrared vibration — had been built on top of this. The Sea's memory was not a layer. It was the ground beneath all layers. The first water. The first instance of a thing being alive in a world that had, until that moment, been only stone and heat and the long, patient silence of minerals waiting. Life had begun here. Life remembered beginning here. And the ocean, which had been the cradle, still carried the cradle's memory — the warmth of it, the salt of it, the irreducible quality of a medium in which the first cell had divided and the first organism had swum and the first creature had crawled toward a shore that it could not see but could somehow feel, guided by a trajectory that was older than instinct and deeper than thought.</w:t>
       </w:r>
     </w:p>
     <w:p>
@@ -9357,7 +9318,7 @@
           <w:rFonts w:ascii="Georgia" w:hAnsi="Georgia"/>
           <w:sz w:val="24"/>
         </w:rPr>
-        <w:t xml:space="preserve">Not from sadness. Not from grief. Not from the accumulated losses of a journey that had cost him the sensation in his hands and the trust that the world was simple. From recognition. Something inside him — deeper than the Know, deeper than the Mold, deeper than the Guide sense that had opened in the Volcano and would not close — something that lived in the architecture of his blood and had been there since birth, dormant — that something recognized the ocean. Not as a place. As a </w:t>
+        <w:t xml:space="preserve">Not from sadness. Not from grief. From recognition. Something inside him — deeper than the Know, deeper than the Mold, deeper than the Guide sense that had opened in the Volcano and would not close — something that lived in the architecture of his blood and had been there since birth, dormant — that something recognized the ocean. Not as a place. As a </w:t>
       </w:r>
       <w:r>
         <w:rPr>
@@ -9372,7 +9333,7 @@
           <w:rFonts w:ascii="Georgia" w:hAnsi="Georgia"/>
           <w:sz w:val="24"/>
         </w:rPr>
-        <w:t>. The same frequency he had heard beneath the Ming lake, beneath the Core's bedrock, beneath the Elder Stone's luminous tone. The Song. The Song and the Sea shared a frequency, because both were origin memories — both were the sound of the world remembering what it was before it was divided, before the seven elements separated, before the disciplines became distinct languages spoken by distinct peoples who had forgotten that they were all dialects of the same tongue.</w:t>
+        <w:t>. The same frequency he had heard beneath the Ming lake, beneath the Core's bedrock, beneath the Elder Stone's luminous tone. The Song and the Sea shared it. Both were origin memories. Both were the world remembering what it was before it was divided.</w:t>
       </w:r>
     </w:p>
     <w:p>
@@ -9434,7 +9395,7 @@
           <w:rFonts w:ascii="Georgia" w:hAnsi="Georgia"/>
           <w:sz w:val="24"/>
         </w:rPr>
-        <w:t>She came from the south, walking the tide line with the specific, purposeful stride of a woman who had been walking this shore for years and who knew every rock and every current and every mood of a sea that had moods the way other bodies of water had temperatures — shifting, tidal, governed by rhythms that were older than the moon that pulled them. She was small — smaller than Aelo had expected, shorter than him by a head, with the lean, wind-dried build of a person who had spent her life outdoors in salt air. Her hair was dark, cut short, practical. Her skin was the brown of the Sea People — a warm, deep tone that carried the record of generations of coastal living, the melanin a memory of sunlight the way the Volcano People's thickness was a memory of heat. Her face was sharp — angular, the features precise, the expression carrying the particular quality of a person who has seen too much and has decided to be amused by it rather than destroyed.</w:t>
+        <w:t>She came from the south, walking the tide line with the purposeful stride of a woman who had been walking this shore for years and who knew every rock and every current and every mood of a sea that had moods the way other bodies of water had temperatures — shifting, tidal, governed by rhythms that were older than the moon that pulled them. She was small — smaller than Aelo had expected, shorter than him by a head, with the lean, wind-dried build of a person who had spent her life outdoors in salt air. Her hair was dark, cut short, practical. Her skin was the brown of the Sea People — a warm, deep tone that carried the record of generations of coastal living, the melanin a memory of sunlight the way the Volcano People's thickness was a memory of heat. Her face was sharp — angular, the features precise, the expression carrying the particular quality of a person who has seen too much and has decided to be amused by it rather than destroyed.</w:t>
       </w:r>
     </w:p>
     <w:p>
@@ -9608,7 +9569,7 @@
           <w:rFonts w:ascii="Georgia" w:hAnsi="Georgia"/>
           <w:sz w:val="24"/>
         </w:rPr>
-        <w:t>Laine nodded. The nod was respect — the specific, earned respect of a woman who had spent her life seeing trajectories and who recognized, in Jalo's calm acceptance, the rarest thing she had ever encountered in a person's momentum: a trajectory that had been chosen. Not imposed. Not inherited. Not the product of prophecy or circumstance or the blind momentum of a life lived without examination. Chosen. Deliberately. With full knowledge of the destination and full acceptance of the cost.</w:t>
+        <w:t>Laine nodded. The nod was respect — the earned respect of a woman who had spent her life seeing trajectories and who recognized, in Jalo's calm acceptance, the rarest thing she had ever encountered in a person's momentum: a trajectory that had been chosen. Not imposed. Not inherited. Not the product of prophecy or circumstance or the blind momentum of a life lived without examination. Chosen. Deliberately. With full knowledge of the destination and full acceptance of the cost.</w:t>
       </w:r>
     </w:p>
     <w:p>
@@ -10371,7 +10332,7 @@
           <w:rFonts w:ascii="Georgia" w:hAnsi="Georgia"/>
           <w:sz w:val="24"/>
         </w:rPr>
-        <w:t>The word hung between them — unspoken, understood, carrying the specific weight of a thing that everyone around him knew and that Aelo was approaching from the inside, feeling its shape the way a blind man feels a room, moving toward a center he could not yet see but could feel pulling.</w:t>
+        <w:t>The word hung between them — unspoken, understood, carrying the weight of a thing that everyone around him knew and that Aelo was approaching from the inside, feeling its shape the way a blind man feels a room, moving toward a center he could not yet see but could feel pulling.</w:t>
       </w:r>
     </w:p>
     <w:p>
@@ -10409,7 +10370,7 @@
           <w:rFonts w:ascii="Georgia" w:hAnsi="Georgia"/>
           <w:sz w:val="24"/>
         </w:rPr>
-        <w:t>Laine taught him to feel the tide — not as water but as trajectory. The tide was going somewhere. Always. The ocean was in constant motion, every wave a trajectory completing itself against the shore, every current a line drawn from one depth to another, the entire system a vast, interlocking web of momentums that a Guide could read the way a Know-walker could read a person's emotional architecture. The tide was the world's largest trajectory — the moon pulling the water, the water following, the following creating a rhythm that was older than life and that life had organized itself around because the rhythm was reliable and reliable things become foundations.</w:t>
+        <w:t>Laine taught him to feel the tide — not as water but as trajectory. The tide was going somewhere. Always. The ocean was in constant motion, every wave a trajectory completing itself against the shore, every current a line drawn from one depth to another, the entire system a vast, interlocking web of momentums, readable to a trained Guide. The tide was the world's largest trajectory — the moon pulling the water, the water following, the following creating a rhythm that was older than life and that life had organized itself around because the rhythm was reliable and reliable things become foundations.</w:t>
       </w:r>
     </w:p>
     <w:p>
@@ -10433,7 +10394,7 @@
           <w:rFonts w:ascii="Georgia" w:hAnsi="Georgia"/>
           <w:sz w:val="24"/>
         </w:rPr>
-        <w:t>He learned to feel the birds. The gulls that circled the shore, riding the thermals, their trajectories clean and simple — rise, turn, dive, rise. Each bird a line in the air, each line readable, each trajectory completing itself with the mechanical precision of creatures that had been flying the same patterns for so long that the patterns were not decisions but memories, the birds' bodies remembering the flight the way the stone had remembered being round.</w:t>
+        <w:t>He learned to feel the birds. The gulls that circled the shore, riding the thermals, their trajectories clean and simple — rise, turn, dive, rise. Each bird a line in the air, each line readable, each trajectory completing itself with the mechanical precision of creatures that had been flying the same patterns for so long that the patterns were not decisions but memories, the birds' bodies remembering the flight.</w:t>
       </w:r>
     </w:p>
     <w:p>
@@ -10469,7 +10430,7 @@
           <w:rFonts w:ascii="Georgia" w:hAnsi="Georgia"/>
           <w:sz w:val="24"/>
         </w:rPr>
-        <w:t>He felt Jalo first. The guardian's trajectory was a straight line — direct, unwavering, pointing forward with the specific, terrifying clarity of a man who had chosen his destination fifteen years ago and had not deviated since. The line ended. Aelo could feel where it ended. The ending was not far. The ending was — he pulled back. He pulled back from Jalo's trajectory the way you pull your hand from a flame, not because the knowledge was wrong but because the knowledge was unbearable and the bearing was not his to do.</w:t>
+        <w:t>He felt Jalo first. The guardian's trajectory was a straight line — direct, unwavering, pointing forward with the terrifying clarity of a man who had chosen his destination fifteen years ago and had not deviated since. The line ended. Aelo could feel where it ended. The ending was not far. The ending was — he pulled back. He pulled back from Jalo's trajectory the way you pull your hand from a flame, not because the knowledge was wrong but because the knowledge was unbearable and the bearing was not his to do.</w:t>
       </w:r>
     </w:p>
     <w:p>
@@ -10517,7 +10478,7 @@
           <w:rFonts w:ascii="Georgia" w:hAnsi="Georgia"/>
           <w:sz w:val="24"/>
         </w:rPr>
-        <w:t>They walked. Aelo did not reach for Jalo's trajectory again. But it was there — a line in the air beside him, straight and short and ending at a point that he could feel the way you feel the edge of a cliff when you're standing near it with your eyes closed. Present. Undeniable. The momentum of a man walking toward a wall with full knowledge and full acceptance and the specific, impossible courage of a person who has decided that the wall is worth reaching.</w:t>
+        <w:t>They walked. Aelo did not reach for Jalo's trajectory again. But it was there — a line in the air beside him, straight and short and ending at a point that he could feel the way you feel the edge of a cliff when you're standing near it with your eyes closed. Present. Undeniable. The momentum of a man walking toward a wall with full knowledge and full acceptance and the impossible courage of a person who has decided that the wall is worth reaching.</w:t>
       </w:r>
     </w:p>
     <w:p>
@@ -10555,7 +10516,7 @@
           <w:rFonts w:ascii="Georgia" w:hAnsi="Georgia"/>
           <w:sz w:val="24"/>
         </w:rPr>
-        <w:t>Aelo was sitting on the shore alone. Jalo slept by the fire — deeper sleep than usual, the body storing rest the way it had stored the Ming's peace, in the deep reservoirs, against the drought ahead. Laine sat farther up the beach, her back against a rock, her eyes open, her attention on the horizon — not looking but feeling, the Guide's perpetual orientation toward the world's momentum.</w:t>
+        <w:t>Aelo was sitting on the shore alone. Jalo slept by the fire — deeper sleep than usual, the body storing rest as it had stored the Ming's peace, in the deep reservoirs, against the drought ahead. Laine sat farther up the beach, her back against a rock, her eyes open, her attention on the horizon — not looking but feeling, the Guide's perpetual orientation toward the world's momentum.</w:t>
       </w:r>
     </w:p>
     <w:p>
@@ -10639,7 +10600,7 @@
           <w:rFonts w:ascii="Georgia" w:hAnsi="Georgia"/>
           <w:sz w:val="24"/>
         </w:rPr>
-        <w:t>And from the center — from the Murkr, from the convergence point, from the dead zone where all seven regions met and where the castle sat and where the stolen magic had created a void in the world's memory — a pull. Not a trajectory. A gravity. The Great Elder Stone, calling to Fletcher's blood the way the ocean called to the rivers — not with voice but with origin, with the specific, inescapable authority of a thing that had been the beginning and that the blood, no matter how diluted, no matter how many generations had passed, could not stop remembering.</w:t>
+        <w:t>And from the center — from the Murkr, from the convergence point, from the dead zone where all seven regions met and where the castle sat and where the stolen magic had created a void in the world's memory — a pull. Not a trajectory. A gravity. The Great Elder Stone, calling to Fletcher's blood the way the ocean called to the rivers — not with voice but with origin, with the inescapable authority of a thing that had been the beginning and that the blood, no matter how diluted, no matter how many generations had passed, could not stop remembering.</w:t>
       </w:r>
     </w:p>
     <w:p>
@@ -10738,7 +10699,7 @@
           <w:rFonts w:ascii="Georgia" w:hAnsi="Georgia"/>
           <w:sz w:val="24"/>
         </w:rPr>
-        <w:t>. Something older. Something that carried the specific weight of a Guide delivering the reading she had been avoiding since the moment she first felt his trajectory.</w:t>
+        <w:t>. Something older. Something that carried the weight of a Guide delivering the reading she had been avoiding since the moment she first felt his trajectory.</w:t>
       </w:r>
     </w:p>
     <w:p>
@@ -10822,7 +10783,7 @@
           <w:rFonts w:ascii="Georgia" w:hAnsi="Georgia"/>
           <w:sz w:val="24"/>
         </w:rPr>
-        <w:t>She did not answer. She did not have to. The answer was in the silence — in the Guide's refusal to describe a trajectory she could see but could not bear to speak, in the specific, eloquent absence of words that was louder than any word could be. The third future existed. She could see it. And the seeing was the grief the fisherman's letter had asked her to carry.</w:t>
+        <w:t>She did not answer. She did not have to. The answer was in the silence — in the Guide's refusal to describe a trajectory she could see but could not bear to speak, in the eloquent absence of words that was louder than any word could be. The third future existed. She could see it. And the seeing was the grief the fisherman's letter had asked her to carry.</w:t>
       </w:r>
     </w:p>
     <w:p>
@@ -10858,7 +10819,7 @@
           <w:rFonts w:ascii="Georgia" w:hAnsi="Georgia"/>
           <w:sz w:val="24"/>
         </w:rPr>
-        <w:t>Laine looked at him. The restless eyes — which had stilled for the reading and which were now resuming their ceaseless, trajectory-scanning motion — stopped again. The stopping was not the Guide-sight focusing. It was surprise. The specific, visible, entirely-human surprise of a woman who had been preparing for a long, agonizing deliberation and who had instead received an answer in four syllables.</w:t>
+        <w:t>Laine looked at him. The restless eyes — which had stilled for the reading and which were now resuming their ceaseless, trajectory-scanning motion — stopped again. The stopping was not the Guide-sight focusing. It was surprise. The visible, entirely-human surprise of a woman who had been preparing for a long, agonizing deliberation and who had instead received an answer in four syllables.</w:t>
       </w:r>
     </w:p>
     <w:p>
@@ -11043,19 +11004,19 @@
           <w:rFonts w:ascii="Georgia" w:hAnsi="Georgia"/>
           <w:sz w:val="24"/>
         </w:rPr>
-        <w:t>The ocean. The Song beneath it. The frequency that the blood remembered and the disciplines had been uncovering, layer by layer, region by region — the Know hearing it, the Mold feeling it in stone, the Guide tracking its momentum through the world. Four disciplines. Four ways of perceiving the same thing. And beneath all four, deeper than any one of them, the harmonic that made them resonate together — the not-yet-Sing, the almost-Song, the frequency that was building in him the way a wave builds before it breaks, gathering mass and speed and the specific, terrifying momentum of a thing that cannot be stopped once it begins.</w:t>
-      </w:r>
-    </w:p>
-    <w:p>
-      <w:pPr>
-        <w:ind w:firstLine="720"/>
-      </w:pPr>
-      <w:r>
-        <w:rPr>
-          <w:rFonts w:ascii="Georgia" w:hAnsi="Georgia"/>
-          <w:sz w:val="24"/>
-        </w:rPr>
-        <w:t>He was terrified. The terror was not new — it had been with him since the herbs stopped, since the Know opened, since the first morning he woke in a body that was growing and a world that was listening and a future that was bearing down on him with the inevitability of a tide. But the terror had a companion now. Something that had not been there before the Ming, before the Core, before the Volcano and the Sea. Something that had arrived in stages, accumulating the way the disciplines had accumulated, building with each teacher and each cost and each act of listening.</w:t>
+        <w:t>The ocean. The Song beneath it. The frequency that the blood remembered and the disciplines had been uncovering, layer by layer, region by region — the Know hearing it, the Mold feeling it in stone, the Guide tracking its momentum through the world. Four disciplines. Four ways of perceiving the same thing. And beneath all four, deeper than any one of them, the harmonic that made them resonate together — the not-yet-Sing, the almost-Song, the frequency that was building in him the way a wave builds before it breaks, gathering mass and speed and the terrifying momentum of a thing that cannot be stopped once it begins.</w:t>
+      </w:r>
+    </w:p>
+    <w:p>
+      <w:pPr>
+        <w:ind w:firstLine="720"/>
+      </w:pPr>
+      <w:r>
+        <w:rPr>
+          <w:rFonts w:ascii="Georgia" w:hAnsi="Georgia"/>
+          <w:sz w:val="24"/>
+        </w:rPr>
+        <w:t>He was terrified. But the terror had a companion now — something that had arrived in stages, building with each teacher and each cost and each act of listening.</w:t>
       </w:r>
     </w:p>
     <w:p>
@@ -11079,19 +11040,7 @@
           <w:rFonts w:ascii="Georgia" w:hAnsi="Georgia"/>
           <w:sz w:val="24"/>
         </w:rPr>
-        <w:t>Not the purpose of prophecy — not the external assignment, the hero's mandate, the chosen-one's obligation. An internal purpose. The specific, private, unreplicable conviction of a boy who had spent fifteen years being nothing and who had, over the course of four regions and four teachers and four disciplines, discovered that the nothing was not absence but potential. Training for a Song he could not yet sing but could feel building in him, note by note, discipline by discipline, cost by cost, the way a cathedral is built — stone by stone, arch by arch, each piece supporting every other piece, the whole becoming larger than the sum of its parts because the parts were not added but harmonized.</w:t>
-      </w:r>
-    </w:p>
-    <w:p>
-      <w:pPr>
-        <w:ind w:firstLine="720"/>
-      </w:pPr>
-      <w:r>
-        <w:rPr>
-          <w:rFonts w:ascii="Georgia" w:hAnsi="Georgia"/>
-          <w:sz w:val="24"/>
-        </w:rPr>
-        <w:t>He held the lake stone. He could not feel it. He could hear it. He could hear everything — the ocean, the stone, the sleeping bodies on the beach, the hunting party moving south, the orbit circling inward, the pull from the center. The world was a web of trajectories, and he was the point where the web converged, and the convergence was not a destination but a beginning.</w:t>
+        <w:t>He held the lake stone. He could not feel it. He could hear it. He could hear everything — the ocean, the stone, the sleeping bodies on the beach, the hunting party moving south, the orbit circling inward, the pull from the center.</w:t>
       </w:r>
     </w:p>
     <w:p>
@@ -11369,7 +11318,7 @@
           <w:rFonts w:ascii="Georgia" w:hAnsi="Georgia"/>
           <w:sz w:val="24"/>
         </w:rPr>
-        <w:t>He knelt on the beach in the dusk and stared at his hands — the hands that had held blades and boxes and the fabric of a woman's dress and the five objects that were his entire identity — and he felt the silence where the note had been. The silence was not the same silence as before. Before, the silence had been absence — the default state of a man whose interior had been hollowed. Now the silence was aftermath — the specific, resonant quiet that follows a note that has been played and that the air still remembers.</w:t>
+        <w:t>He knelt on the beach in the dusk and stared at his hands — the hands that had held blades and boxes and the fabric of a woman's dress and the five objects that were his entire identity — and he felt the silence where the note had been. The silence was not the same silence as before. Before, the silence had been absence — the default state of a man whose interior had been hollowed. Now the silence was aftermath — the resonant quiet that follows a note that has been played and that the air still remembers.</w:t>
       </w:r>
     </w:p>
     <w:p>
@@ -11756,7 +11705,7 @@
           <w:rFonts w:ascii="Georgia" w:hAnsi="Georgia"/>
           <w:sz w:val="24"/>
         </w:rPr>
-        <w:t>Laine stopped too. She did not turn. She had felt it before it happened — the shift in Aelo's trajectory, the moment the momentum changed, the line bending from south to north with the specific, irreversible quality of a decision that has been made in the blood before it has been made in the mind.</w:t>
+        <w:t>Laine stopped too. She did not turn. She had felt it before it happened — the shift in Aelo's trajectory, the moment the momentum changed, the line bending from south to north with the irreversible quality of a decision that has been made in the blood before it has been made in the mind.</w:t>
       </w:r>
     </w:p>
     <w:p>
@@ -11882,7 +11831,7 @@
           <w:rFonts w:ascii="Georgia" w:hAnsi="Georgia"/>
           <w:sz w:val="24"/>
         </w:rPr>
-        <w:t>Jalo stared at him. Something in the scarred face shifted — not the muscles, not the expression, something deeper. Something in the architecture beneath the face, in the structural foundation on which fifteen years of guardianship and sacrifice and the specific, total commitment of a man who had given up his name and his face and his sobriety to keep one small life burning had been built. The weight of a realization that the man had been expecting for fifteen years and dreading for fifteen years and hoping for fifteen years and that had arrived, finally, on a coastal road in the salt air with the ocean beside them and the hunters behind them and the Song ahead: the boy was becoming the man. And the man was starting to sound like the prophecy.</w:t>
+        <w:t>Jalo stared at him. Something in the scarred face shifted — not the muscles, not the expression, something deeper. Something in the architecture beneath the face, in the structural foundation on which fifteen years of guardianship and sacrifice and the total commitment of a man who had given up his name and his face and his sobriety to keep one small life burning had been built. The weight of a realization that the man had been expecting for fifteen years and dreading for fifteen years and hoping for fifteen years and that had arrived, finally, on a coastal road in the salt air with the ocean beside them and the hunters behind them and the Song ahead: the boy was becoming the man. And the man was starting to sound like the prophecy.</w:t>
       </w:r>
     </w:p>
     <w:p>
@@ -11981,7 +11930,7 @@
           <w:rFonts w:ascii="Georgia" w:hAnsi="Georgia"/>
           <w:sz w:val="24"/>
         </w:rPr>
-        <w:t xml:space="preserve">"Maera," Jalo said. The name came out with the specific quality of a word that has been held in the mouth for years and is being spoken for the first time in the air. "Her name was Maera. She was a Cloud Singer. The last one born with the full Sing in her blood. She died holding a lullaby she'd been singing to you since you were born. The lullaby was the Song — not the full Song, not the seven-harmonic, not the world-remaking frequency that Fletcher used. A fragment. A lullaby version. Enough to keep you safe. Enough to tell the world's memory: </w:t>
+        <w:t xml:space="preserve">"Maera," Jalo said. The name came out with the quality of a word that has been held in the mouth for years and is being spoken for the first time in the air. "Her name was Maera. She was a Cloud Singer. The last one born with the full Sing in her blood. She died holding a lullaby she'd been singing to you since you were born. The lullaby was the Song — not the full Song, not the seven-harmonic, not the world-remaking frequency that Fletcher used. A fragment. A lullaby version. Enough to keep you safe. Enough to tell the world's memory: </w:t>
       </w:r>
       <w:r>
         <w:rPr>
@@ -12068,7 +12017,7 @@
           <w:rFonts w:ascii="Georgia" w:hAnsi="Georgia"/>
           <w:sz w:val="24"/>
         </w:rPr>
-        <w:t>"Your mother would be proud," Jalo said. The words were quiet. The roughness was gone — replaced by something that Aelo's Know could feel but could not categorize because the feeling was new, was being felt by Jalo for the first time, was the specific, unprecedented emotional frequency of a man who has carried a child for fifteen years and is watching the child become the reason the carrying was worth it.</w:t>
+        <w:t>"Your mother would be proud," Jalo said. The words were quiet. The roughness was gone — replaced by something that Aelo's Know could feel but could not categorize because the feeling was new, was being felt by Jalo for the first time, was the unprecedented emotional frequency of a man who has carried a child for fifteen years and is watching the child become the reason the carrying was worth it.</w:t>
       </w:r>
     </w:p>
     <w:p>

</xml_diff>